<commit_message>
working on underfitting and overfitting
</commit_message>
<xml_diff>
--- a/Notes/Machine Learning With Python.docx
+++ b/Notes/Machine Learning With Python.docx
@@ -121,85 +121,7 @@
         <w:rPr>
           <w:rFonts w:ascii="Calibri" w:hAnsi="Calibri" w:cs="Calibri"/>
         </w:rPr>
-        <w:t xml:space="preserve"> </w:t>
-      </w:r>
-      <w:r>
-        <w:rPr>
-          <w:rFonts w:ascii="Calibri" w:hAnsi="Calibri" w:cs="Calibri"/>
-        </w:rPr>
-        <w:t>You have past house data</w:t>
-      </w:r>
-      <w:r>
-        <w:rPr>
-          <w:rFonts w:ascii="Calibri" w:hAnsi="Calibri" w:cs="Calibri"/>
-        </w:rPr>
-        <w:t xml:space="preserve">; </w:t>
-      </w:r>
-      <w:r>
-        <w:rPr>
-          <w:rFonts w:ascii="Calibri" w:hAnsi="Calibri" w:cs="Calibri"/>
-        </w:rPr>
-        <w:t>size, location, number of rooms</w:t>
-      </w:r>
-      <w:r>
-        <w:rPr>
-          <w:rFonts w:ascii="Calibri" w:hAnsi="Calibri" w:cs="Calibri"/>
-        </w:rPr>
-        <w:t xml:space="preserve">, </w:t>
-      </w:r>
-      <w:r>
-        <w:rPr>
-          <w:rFonts w:ascii="Calibri" w:hAnsi="Calibri" w:cs="Calibri"/>
-        </w:rPr>
-        <w:t>actual sale price</w:t>
-      </w:r>
-      <w:r>
-        <w:rPr>
-          <w:rFonts w:ascii="Calibri" w:hAnsi="Calibri" w:cs="Calibri"/>
-        </w:rPr>
-        <w:t xml:space="preserve">. </w:t>
-      </w:r>
-      <w:r>
-        <w:rPr>
-          <w:rFonts w:ascii="Calibri" w:hAnsi="Calibri" w:cs="Calibri"/>
-        </w:rPr>
-        <w:t>You train a model on those examples.</w:t>
-      </w:r>
-      <w:r>
-        <w:rPr>
-          <w:rFonts w:ascii="Calibri" w:hAnsi="Calibri" w:cs="Calibri"/>
-        </w:rPr>
-        <w:t xml:space="preserve"> </w:t>
-      </w:r>
-      <w:r>
-        <w:rPr>
-          <w:rFonts w:ascii="Calibri" w:hAnsi="Calibri" w:cs="Calibri"/>
-        </w:rPr>
-        <w:t>Then a new house appears, one that was not in the training data.</w:t>
-      </w:r>
-      <w:r>
-        <w:rPr>
-          <w:rFonts w:ascii="Calibri" w:hAnsi="Calibri" w:cs="Calibri"/>
-        </w:rPr>
-        <w:t xml:space="preserve"> </w:t>
-      </w:r>
-      <w:r>
-        <w:rPr>
-          <w:rFonts w:ascii="Calibri" w:hAnsi="Calibri" w:cs="Calibri"/>
-        </w:rPr>
-        <w:t>The real goal is for the model to predict that new house’s price well.</w:t>
-      </w:r>
-      <w:r>
-        <w:rPr>
-          <w:rFonts w:ascii="Calibri" w:hAnsi="Calibri" w:cs="Calibri"/>
-        </w:rPr>
-        <w:t xml:space="preserve"> </w:t>
-      </w:r>
-      <w:r>
-        <w:rPr>
-          <w:rFonts w:ascii="Calibri" w:hAnsi="Calibri" w:cs="Calibri"/>
-        </w:rPr>
-        <w:t xml:space="preserve">That is the meaning of </w:t>
+        <w:t xml:space="preserve"> You have past house data; size, location, number of rooms, actual sale price. You train a model on those examples. Then a new house appears, one that was not in the training data. The real goal is for the model to predict that new house’s price well. That is the meaning of </w:t>
       </w:r>
       <w:r>
         <w:rPr>
@@ -312,44 +234,20 @@
         <w:rPr>
           <w:rFonts w:ascii="Calibri" w:hAnsi="Calibri" w:cs="Calibri"/>
         </w:rPr>
-        <w:t xml:space="preserve"> </w:t>
-      </w:r>
-      <w:r>
-        <w:rPr>
-          <w:rFonts w:ascii="Calibri" w:hAnsi="Calibri" w:cs="Calibri"/>
-        </w:rPr>
-        <w:t xml:space="preserve">Classification is used to predict the label, or category, of an observation. </w:t>
-      </w:r>
-    </w:p>
-    <w:p>
-      <w:pPr>
-        <w:rPr>
-          <w:rFonts w:ascii="Calibri" w:hAnsi="Calibri" w:cs="Calibri"/>
-        </w:rPr>
-      </w:pPr>
-      <w:r>
-        <w:rPr>
-          <w:rFonts w:ascii="Calibri" w:hAnsi="Calibri" w:cs="Calibri"/>
-        </w:rPr>
-        <w:t>Example:</w:t>
-      </w:r>
-      <w:r>
-        <w:rPr>
-          <w:rFonts w:ascii="Calibri" w:hAnsi="Calibri" w:cs="Calibri"/>
-        </w:rPr>
-        <w:t xml:space="preserve"> </w:t>
-      </w:r>
-      <w:r>
-        <w:rPr>
-          <w:rFonts w:ascii="Calibri" w:hAnsi="Calibri" w:cs="Calibri"/>
-        </w:rPr>
-        <w:t>W</w:t>
-      </w:r>
-      <w:r>
-        <w:rPr>
-          <w:rFonts w:ascii="Calibri" w:hAnsi="Calibri" w:cs="Calibri"/>
-        </w:rPr>
-        <w:t>e can predict whether a bank transaction is fraudulent or not. As there are two outcomes here - a fraudulent transaction, or non-fraudulent transaction, this is known as binary classification.</w:t>
+        <w:t xml:space="preserve"> Classification is used to predict the label, or category, of an observation. </w:t>
+      </w:r>
+    </w:p>
+    <w:p>
+      <w:pPr>
+        <w:rPr>
+          <w:rFonts w:ascii="Calibri" w:hAnsi="Calibri" w:cs="Calibri"/>
+        </w:rPr>
+      </w:pPr>
+      <w:r>
+        <w:rPr>
+          <w:rFonts w:ascii="Calibri" w:hAnsi="Calibri" w:cs="Calibri"/>
+        </w:rPr>
+        <w:t>Example: We can predict whether a bank transaction is fraudulent or not. As there are two outcomes here - a fraudulent transaction, or non-fraudulent transaction, this is known as binary classification.</w:t>
       </w:r>
     </w:p>
     <w:p>
@@ -441,7 +339,17 @@
     </w:p>
     <w:p>
       <w:r>
-        <w:t>KNN (k-Nearest Neighbors) is an algorithm for classification problems.</w:t>
+        <w:t xml:space="preserve">KNN (k-Nearest Neighbors) is an algorithm for </w:t>
+      </w:r>
+      <w:r>
+        <w:rPr>
+          <w:b/>
+          <w:bCs/>
+        </w:rPr>
+        <w:t>classification problems</w:t>
+      </w:r>
+      <w:r>
+        <w:t>.</w:t>
       </w:r>
     </w:p>
     <w:p>
@@ -461,49 +369,49 @@
           <w:b/>
           <w:bCs/>
         </w:rPr>
+        <w:t>Regression</w:t>
+      </w:r>
+    </w:p>
+    <w:p>
+      <w:pPr>
+        <w:pStyle w:val="ListParagraph"/>
+      </w:pPr>
+      <w:r>
+        <w:t>In regression tasks, the target variable typically has continuous values, such as a country's GDP, or the price of a house.</w:t>
+      </w:r>
+    </w:p>
+    <w:p>
+      <w:pPr>
+        <w:rPr>
+          <w:b/>
+          <w:bCs/>
+        </w:rPr>
+      </w:pPr>
+      <w:r>
+        <w:rPr>
+          <w:b/>
+          <w:bCs/>
+        </w:rPr>
+        <w:t xml:space="preserve">Note: </w:t>
+      </w:r>
+      <w:r>
+        <w:t>F</w:t>
+      </w:r>
+      <w:r>
+        <w:t>eatures must be formatted as a two-dimensional array to be accepted by scikit-learn.</w:t>
+      </w:r>
+    </w:p>
+    <w:p>
+      <w:r>
+        <w:t>L</w:t>
+      </w:r>
+      <w:r>
+        <w:t>inear regression in scikit-learn performs OLS under the hood.</w:t>
+      </w:r>
+    </w:p>
+    <w:p>
+      <w:r>
         <w:lastRenderedPageBreak/>
-        <w:t>Regression</w:t>
-      </w:r>
-    </w:p>
-    <w:p>
-      <w:pPr>
-        <w:pStyle w:val="ListParagraph"/>
-      </w:pPr>
-      <w:r>
-        <w:t>In regression tasks, the target variable typically has continuous values, such as a country's GDP, or the price of a house.</w:t>
-      </w:r>
-    </w:p>
-    <w:p>
-      <w:pPr>
-        <w:rPr>
-          <w:b/>
-          <w:bCs/>
-        </w:rPr>
-      </w:pPr>
-      <w:r>
-        <w:rPr>
-          <w:b/>
-          <w:bCs/>
-        </w:rPr>
-        <w:t xml:space="preserve">Note: </w:t>
-      </w:r>
-      <w:r>
-        <w:t>F</w:t>
-      </w:r>
-      <w:r>
-        <w:t>eatures must be formatted as a two-dimensional array to be accepted by scikit-learn.</w:t>
-      </w:r>
-    </w:p>
-    <w:p>
-      <w:r>
-        <w:t>L</w:t>
-      </w:r>
-      <w:r>
-        <w:t>inear regression in scikit-learn performs OLS under the hood.</w:t>
-      </w:r>
-    </w:p>
-    <w:p>
-      <w:r>
         <w:t>R</w:t>
       </w:r>
       <w:r>
@@ -546,7 +454,7 @@
     </w:p>
     <w:sectPr>
       <w:pgSz w:w="12240" w:h="15840"/>
-      <w:pgMar w:top="1440" w:right="1440" w:bottom="1440" w:left="1440" w:header="720" w:footer="720" w:gutter="0"/>
+      <w:pgMar w:top="1008" w:right="864" w:bottom="1008" w:left="864" w:header="720" w:footer="720" w:gutter="0"/>
       <w:cols w:space="720"/>
       <w:docGrid w:linePitch="360"/>
     </w:sectPr>

</xml_diff>

<commit_message>
working r score and MSE for resgression performance
</commit_message>
<xml_diff>
--- a/Notes/Machine Learning With Python.docx
+++ b/Notes/Machine Learning With Python.docx
@@ -1,6 +1,6 @@
 
 <file path=word/document.xml><?xml version="1.0" encoding="utf-8"?>
-<w:document xmlns:wpc="http://schemas.microsoft.com/office/word/2010/wordprocessingCanvas" xmlns:cx="http://schemas.microsoft.com/office/drawing/2014/chartex" xmlns:cx1="http://schemas.microsoft.com/office/drawing/2015/9/8/chartex" xmlns:cx2="http://schemas.microsoft.com/office/drawing/2015/10/21/chartex" xmlns:cx3="http://schemas.microsoft.com/office/drawing/2016/5/9/chartex" xmlns:cx4="http://schemas.microsoft.com/office/drawing/2016/5/10/chartex" xmlns:cx5="http://schemas.microsoft.com/office/drawing/2016/5/11/chartex" xmlns:cx6="http://schemas.microsoft.com/office/drawing/2016/5/12/chartex" xmlns:cx7="http://schemas.microsoft.com/office/drawing/2016/5/13/chartex" xmlns:cx8="http://schemas.microsoft.com/office/drawing/2016/5/14/chartex" xmlns:mc="http://schemas.openxmlformats.org/markup-compatibility/2006" xmlns:aink="http://schemas.microsoft.com/office/drawing/2016/ink" xmlns:am3d="http://schemas.microsoft.com/office/drawing/2017/model3d" xmlns:o="urn:schemas-microsoft-com:office:office" xmlns:oel="http://schemas.microsoft.com/office/2019/extlst" xmlns:r="http://schemas.openxmlformats.org/officeDocument/2006/relationships" xmlns:m="http://schemas.openxmlformats.org/officeDocument/2006/math" xmlns:v="urn:schemas-microsoft-com:vml" xmlns:wp14="http://schemas.microsoft.com/office/word/2010/wordprocessingDrawing" xmlns:wp="http://schemas.openxmlformats.org/drawingml/2006/wordprocessingDrawing" xmlns:w10="urn:schemas-microsoft-com:office:word" xmlns:w="http://schemas.openxmlformats.org/wordprocessingml/2006/main" xmlns:w14="http://schemas.microsoft.com/office/word/2010/wordml" xmlns:w15="http://schemas.microsoft.com/office/word/2012/wordml" xmlns:w16cex="http://schemas.microsoft.com/office/word/2018/wordml/cex" xmlns:w16cid="http://schemas.microsoft.com/office/word/2016/wordml/cid" xmlns:w16="http://schemas.microsoft.com/office/word/2018/wordml" xmlns:w16du="http://schemas.microsoft.com/office/word/2023/wordml/word16du" xmlns:w16sdtdh="http://schemas.microsoft.com/office/word/2020/wordml/sdtdatahash" xmlns:w16sdtfl="http://schemas.microsoft.com/office/word/2024/wordml/sdtformatlock" xmlns:w16se="http://schemas.microsoft.com/office/word/2015/wordml/symex" xmlns:wpg="http://schemas.microsoft.com/office/word/2010/wordprocessingGroup" xmlns:wpi="http://schemas.microsoft.com/office/word/2010/wordprocessingInk" xmlns:wne="http://schemas.microsoft.com/office/word/2006/wordml" xmlns:wps="http://schemas.microsoft.com/office/word/2010/wordprocessingShape" mc:Ignorable="w14 w15 w16se w16cid w16 w16cex w16sdtdh w16sdtfl w16du wp14">
+<w:document xmlns:wpc="http://schemas.microsoft.com/office/word/2010/wordprocessingCanvas" xmlns:cx="http://schemas.microsoft.com/office/drawing/2014/chartex" xmlns:cx1="http://schemas.microsoft.com/office/drawing/2015/9/8/chartex" xmlns:cx2="http://schemas.microsoft.com/office/drawing/2015/10/21/chartex" xmlns:cx3="http://schemas.microsoft.com/office/drawing/2016/5/9/chartex" xmlns:cx4="http://schemas.microsoft.com/office/drawing/2016/5/10/chartex" xmlns:cx5="http://schemas.microsoft.com/office/drawing/2016/5/11/chartex" xmlns:cx6="http://schemas.microsoft.com/office/drawing/2016/5/12/chartex" xmlns:cx7="http://schemas.microsoft.com/office/drawing/2016/5/13/chartex" xmlns:cx8="http://schemas.microsoft.com/office/drawing/2016/5/14/chartex" xmlns:mc="http://schemas.openxmlformats.org/markup-compatibility/2006" xmlns:m="http://schemas.openxmlformats.org/officeDocument/2006/math" xmlns:aink="http://schemas.microsoft.com/office/drawing/2016/ink" xmlns:am3d="http://schemas.microsoft.com/office/drawing/2017/model3d" xmlns:oel="http://schemas.microsoft.com/office/2019/extlst" xmlns:r="http://schemas.openxmlformats.org/officeDocument/2006/relationships" xmlns:wp14="http://schemas.microsoft.com/office/word/2010/wordprocessingDrawing" xmlns:wp="http://schemas.openxmlformats.org/drawingml/2006/wordprocessingDrawing" xmlns:wpg="http://schemas.microsoft.com/office/word/2010/wordprocessingGroup" xmlns:wpi="http://schemas.microsoft.com/office/word/2010/wordprocessingInk" xmlns:wps="http://schemas.microsoft.com/office/word/2010/wordprocessingShape" xmlns:o="urn:schemas-microsoft-com:office:office" xmlns:v="urn:schemas-microsoft-com:vml" xmlns:w10="urn:schemas-microsoft-com:office:word" xmlns:w="http://schemas.openxmlformats.org/wordprocessingml/2006/main" xmlns:w14="http://schemas.microsoft.com/office/word/2010/wordml" xmlns:w15="http://schemas.microsoft.com/office/word/2012/wordml" xmlns:w16cex="http://schemas.microsoft.com/office/word/2018/wordml/cex" xmlns:w16cid="http://schemas.microsoft.com/office/word/2016/wordml/cid" xmlns:w16="http://schemas.microsoft.com/office/word/2018/wordml" xmlns:w16sdtdh="http://schemas.microsoft.com/office/word/2020/wordml/sdtdatahash" xmlns:w16sdtfl="http://schemas.microsoft.com/office/word/2024/wordml/sdtformatlock" xmlns:w16se="http://schemas.microsoft.com/office/word/2015/wordml/symex" xmlns:w16du="http://schemas.microsoft.com/office/word/2023/wordml/word16du" xmlns:wne="http://schemas.microsoft.com/office/word/2006/wordml" mc:Ignorable="w14 w15 w16se w16cid w16 w16cex w16sdtdh w16sdtfl w16du wp14">
   <w:body>
     <w:p>
       <w:pPr>
@@ -412,6 +412,56 @@
     <w:p>
       <w:r>
         <w:lastRenderedPageBreak/>
+        <w:t>RSS:</w:t>
+      </w:r>
+    </w:p>
+    <w:p>
+      <w:r>
+        <w:t>Residual = actual value – predicted value</w:t>
+      </w:r>
+    </w:p>
+    <w:p>
+      <w:r>
+        <w:t>RSS means, take every prediction error, square it, and add all errors together.</w:t>
+      </w:r>
+    </w:p>
+    <w:p>
+      <w:r>
+        <w:t>The model will choose the line with the smallest RSS.</w:t>
+      </w:r>
+    </w:p>
+    <w:p>
+      <w:pPr>
+        <w:rPr>
+          <w:b/>
+          <w:bCs/>
+        </w:rPr>
+      </w:pPr>
+      <w:r>
+        <w:rPr>
+          <w:b/>
+          <w:bCs/>
+        </w:rPr>
+        <w:t>Why do we square the errors?</w:t>
+      </w:r>
+    </w:p>
+    <w:p>
+      <w:pPr>
+        <w:rPr>
+          <w:b/>
+          <w:bCs/>
+        </w:rPr>
+      </w:pPr>
+      <w:r>
+        <w:rPr>
+          <w:b/>
+          <w:bCs/>
+        </w:rPr>
+        <w:t>Because errors can be positive or negative.</w:t>
+      </w:r>
+    </w:p>
+    <w:p>
+      <w:r>
         <w:t>R</w:t>
       </w:r>
       <w:r>
@@ -463,7 +513,7 @@
 </file>
 
 <file path=word/numbering.xml><?xml version="1.0" encoding="utf-8"?>
-<w:numbering xmlns:wpc="http://schemas.microsoft.com/office/word/2010/wordprocessingCanvas" xmlns:cx="http://schemas.microsoft.com/office/drawing/2014/chartex" xmlns:cx1="http://schemas.microsoft.com/office/drawing/2015/9/8/chartex" xmlns:cx2="http://schemas.microsoft.com/office/drawing/2015/10/21/chartex" xmlns:cx3="http://schemas.microsoft.com/office/drawing/2016/5/9/chartex" xmlns:cx4="http://schemas.microsoft.com/office/drawing/2016/5/10/chartex" xmlns:cx5="http://schemas.microsoft.com/office/drawing/2016/5/11/chartex" xmlns:cx6="http://schemas.microsoft.com/office/drawing/2016/5/12/chartex" xmlns:cx7="http://schemas.microsoft.com/office/drawing/2016/5/13/chartex" xmlns:cx8="http://schemas.microsoft.com/office/drawing/2016/5/14/chartex" xmlns:mc="http://schemas.openxmlformats.org/markup-compatibility/2006" xmlns:aink="http://schemas.microsoft.com/office/drawing/2016/ink" xmlns:am3d="http://schemas.microsoft.com/office/drawing/2017/model3d" xmlns:o="urn:schemas-microsoft-com:office:office" xmlns:oel="http://schemas.microsoft.com/office/2019/extlst" xmlns:r="http://schemas.openxmlformats.org/officeDocument/2006/relationships" xmlns:m="http://schemas.openxmlformats.org/officeDocument/2006/math" xmlns:v="urn:schemas-microsoft-com:vml" xmlns:wp14="http://schemas.microsoft.com/office/word/2010/wordprocessingDrawing" xmlns:wp="http://schemas.openxmlformats.org/drawingml/2006/wordprocessingDrawing" xmlns:w10="urn:schemas-microsoft-com:office:word" xmlns:w="http://schemas.openxmlformats.org/wordprocessingml/2006/main" xmlns:w14="http://schemas.microsoft.com/office/word/2010/wordml" xmlns:w15="http://schemas.microsoft.com/office/word/2012/wordml" xmlns:w16cex="http://schemas.microsoft.com/office/word/2018/wordml/cex" xmlns:w16cid="http://schemas.microsoft.com/office/word/2016/wordml/cid" xmlns:w16="http://schemas.microsoft.com/office/word/2018/wordml" xmlns:w16du="http://schemas.microsoft.com/office/word/2023/wordml/word16du" xmlns:w16sdtdh="http://schemas.microsoft.com/office/word/2020/wordml/sdtdatahash" xmlns:w16sdtfl="http://schemas.microsoft.com/office/word/2024/wordml/sdtformatlock" xmlns:w16se="http://schemas.microsoft.com/office/word/2015/wordml/symex" xmlns:wpg="http://schemas.microsoft.com/office/word/2010/wordprocessingGroup" xmlns:wpi="http://schemas.microsoft.com/office/word/2010/wordprocessingInk" xmlns:wne="http://schemas.microsoft.com/office/word/2006/wordml" xmlns:wps="http://schemas.microsoft.com/office/word/2010/wordprocessingShape" mc:Ignorable="w14 w15 w16se w16cid w16 w16cex w16sdtdh w16sdtfl w16du wp14">
+<w:numbering xmlns:wpc="http://schemas.microsoft.com/office/word/2010/wordprocessingCanvas" xmlns:cx="http://schemas.microsoft.com/office/drawing/2014/chartex" xmlns:cx1="http://schemas.microsoft.com/office/drawing/2015/9/8/chartex" xmlns:cx2="http://schemas.microsoft.com/office/drawing/2015/10/21/chartex" xmlns:cx3="http://schemas.microsoft.com/office/drawing/2016/5/9/chartex" xmlns:cx4="http://schemas.microsoft.com/office/drawing/2016/5/10/chartex" xmlns:cx5="http://schemas.microsoft.com/office/drawing/2016/5/11/chartex" xmlns:cx6="http://schemas.microsoft.com/office/drawing/2016/5/12/chartex" xmlns:cx7="http://schemas.microsoft.com/office/drawing/2016/5/13/chartex" xmlns:cx8="http://schemas.microsoft.com/office/drawing/2016/5/14/chartex" xmlns:mc="http://schemas.openxmlformats.org/markup-compatibility/2006" xmlns:m="http://schemas.openxmlformats.org/officeDocument/2006/math" xmlns:aink="http://schemas.microsoft.com/office/drawing/2016/ink" xmlns:am3d="http://schemas.microsoft.com/office/drawing/2017/model3d" xmlns:oel="http://schemas.microsoft.com/office/2019/extlst" xmlns:r="http://schemas.openxmlformats.org/officeDocument/2006/relationships" xmlns:wp14="http://schemas.microsoft.com/office/word/2010/wordprocessingDrawing" xmlns:wp="http://schemas.openxmlformats.org/drawingml/2006/wordprocessingDrawing" xmlns:wpg="http://schemas.microsoft.com/office/word/2010/wordprocessingGroup" xmlns:wpi="http://schemas.microsoft.com/office/word/2010/wordprocessingInk" xmlns:wps="http://schemas.microsoft.com/office/word/2010/wordprocessingShape" xmlns:o="urn:schemas-microsoft-com:office:office" xmlns:v="urn:schemas-microsoft-com:vml" xmlns:w10="urn:schemas-microsoft-com:office:word" xmlns:w="http://schemas.openxmlformats.org/wordprocessingml/2006/main" xmlns:w14="http://schemas.microsoft.com/office/word/2010/wordml" xmlns:w15="http://schemas.microsoft.com/office/word/2012/wordml" xmlns:w16cex="http://schemas.microsoft.com/office/word/2018/wordml/cex" xmlns:w16cid="http://schemas.microsoft.com/office/word/2016/wordml/cid" xmlns:w16="http://schemas.microsoft.com/office/word/2018/wordml" xmlns:w16sdtdh="http://schemas.microsoft.com/office/word/2020/wordml/sdtdatahash" xmlns:w16sdtfl="http://schemas.microsoft.com/office/word/2024/wordml/sdtformatlock" xmlns:w16se="http://schemas.microsoft.com/office/word/2015/wordml/symex" xmlns:w16du="http://schemas.microsoft.com/office/word/2023/wordml/word16du" xmlns:wne="http://schemas.microsoft.com/office/word/2006/wordml" mc:Ignorable="w14 w15 w16se w16cid w16 w16cex w16sdtdh w16sdtfl w16du wp14">
   <w:abstractNum w:abstractNumId="0" w15:restartNumberingAfterBreak="0">
     <w:nsid w:val="1AC52E45"/>
     <w:multiLevelType w:val="hybridMultilevel"/>
@@ -584,7 +634,7 @@
 </file>
 
 <file path=word/styles.xml><?xml version="1.0" encoding="utf-8"?>
-<w:styles xmlns:mc="http://schemas.openxmlformats.org/markup-compatibility/2006" xmlns:r="http://schemas.openxmlformats.org/officeDocument/2006/relationships" xmlns:w="http://schemas.openxmlformats.org/wordprocessingml/2006/main" xmlns:w14="http://schemas.microsoft.com/office/word/2010/wordml" xmlns:w15="http://schemas.microsoft.com/office/word/2012/wordml" xmlns:w16cex="http://schemas.microsoft.com/office/word/2018/wordml/cex" xmlns:w16cid="http://schemas.microsoft.com/office/word/2016/wordml/cid" xmlns:w16="http://schemas.microsoft.com/office/word/2018/wordml" xmlns:w16du="http://schemas.microsoft.com/office/word/2023/wordml/word16du" xmlns:w16sdtdh="http://schemas.microsoft.com/office/word/2020/wordml/sdtdatahash" xmlns:w16sdtfl="http://schemas.microsoft.com/office/word/2024/wordml/sdtformatlock" xmlns:w16se="http://schemas.microsoft.com/office/word/2015/wordml/symex" mc:Ignorable="w14 w15 w16se w16cid w16 w16cex w16sdtdh w16sdtfl w16du">
+<w:styles xmlns:mc="http://schemas.openxmlformats.org/markup-compatibility/2006" xmlns:r="http://schemas.openxmlformats.org/officeDocument/2006/relationships" xmlns:w="http://schemas.openxmlformats.org/wordprocessingml/2006/main" xmlns:w14="http://schemas.microsoft.com/office/word/2010/wordml" xmlns:w15="http://schemas.microsoft.com/office/word/2012/wordml" xmlns:w16cex="http://schemas.microsoft.com/office/word/2018/wordml/cex" xmlns:w16cid="http://schemas.microsoft.com/office/word/2016/wordml/cid" xmlns:w16="http://schemas.microsoft.com/office/word/2018/wordml" xmlns:w16sdtdh="http://schemas.microsoft.com/office/word/2020/wordml/sdtdatahash" xmlns:w16sdtfl="http://schemas.microsoft.com/office/word/2024/wordml/sdtformatlock" xmlns:w16se="http://schemas.microsoft.com/office/word/2015/wordml/symex" xmlns:w16du="http://schemas.microsoft.com/office/word/2023/wordml/word16du" mc:Ignorable="w14 w15 w16se w16cid w16 w16cex w16sdtdh w16sdtfl w16du">
   <w:docDefaults>
     <w:rPrDefault>
       <w:rPr>

</xml_diff>